<commit_message>
Update uncle factsheet for agy setup
</commit_message>
<xml_diff>
--- a/docs/uncle-handoff/FACTSHEET.docx
+++ b/docs/uncle-handoff/FACTSHEET.docx
@@ -6318,7 +6318,7 @@
           <w:rtl w:val="0"/>
           <w:lang w:val="en-US"/>
         </w:rPr>
-        <w:t xml:space="preserve">Gemini access and a web browser:</w:t>
+        <w:t xml:space="preserve">Gemini access and agy:</w:t>
       </w:r>
       <w:r>
         <w:rPr>
@@ -6327,7 +6327,7 @@
           <w:rtl w:val="0"/>
           <w:lang w:val="en-US"/>
         </w:rPr>
-        <w:t xml:space="preserve"> provide cross-family review of the plan and contract. Codex verifies model access and practices the manual browser handoff with you. This route requires no Gemini CLI or API key.</w:t>
+        <w:t xml:space="preserve"> provide cross-family review of the plan and contract. Codex verifies the subscription-only disposable request-review setup and preserves strict manual browser handoff for high-sensitivity work. Neither route needs an API key.</w:t>
       </w:r>
     </w:p>
     <w:p>

</xml_diff>

<commit_message>
Finalize Workflow-Kit handoff factsheet
</commit_message>
<xml_diff>
--- a/docs/uncle-handoff/FACTSHEET.docx
+++ b/docs/uncle-handoff/FACTSHEET.docx
@@ -33,7 +33,7 @@
             </w14:solidFill>
           </w14:textFill>
         </w:rPr>
-        <w:t>Kit 2.31.0   |   12 September 2026</w:t>
+        <w:t>Kit 2.32.0   |   13 September 2026</w:t>
       </w:r>
     </w:p>
     <w:p>
@@ -7940,7 +7940,7 @@
           <w:rtl w:val="0"/>
           <w:lang w:val="en-US"/>
         </w:rPr>
-        <w:t xml:space="preserve"> v2.31.0 installs the skill but does not copy </w:t>
+        <w:t xml:space="preserve"> v2.32.0 installs the skill but does not copy </w:t>
       </w:r>
       <w:r>
         <w:rPr>

</xml_diff>